<commit_message>
Review and update the Evaluation Part
</commit_message>
<xml_diff>
--- a/Canabis_Benefits_A30.docx
+++ b/Canabis_Benefits_A30.docx
@@ -2978,19 +2978,11 @@
           <w:rFonts w:ascii="Times New Roman" w:hAnsi="Times New Roman" w:cs="Times New Roman"/>
         </w:rPr>
       </w:pPr>
-      <w:proofErr w:type="spellStart"/>
-      <w:r>
-        <w:rPr>
-          <w:rFonts w:ascii="Times New Roman" w:hAnsi="Times New Roman" w:cs="Times New Roman"/>
-        </w:rPr>
-        <w:t>Sarvet</w:t>
-      </w:r>
-      <w:proofErr w:type="spellEnd"/>
-      <w:r>
-        <w:rPr>
-          <w:rFonts w:ascii="Times New Roman" w:hAnsi="Times New Roman" w:cs="Times New Roman"/>
-        </w:rPr>
-        <w:t xml:space="preserve"> et al. (2018) have analyzed the trends in cannabis use in various states over time and stated that the common opinion and behavior in the population often does not coincide with the scientifically proven view and evidence-based guidelines. Their longitudinal study revealed that the liberalization of recreational laws raised the consumption rates regardless of the quality of the evidence that related to the medical use which indicated that the sociopolitical factors, other than the scientific evidence, was the main determinant of the formation of the behavior of the population and the trend of the use of cannabis</w:t>
+      <w:r>
+        <w:rPr>
+          <w:rFonts w:ascii="Times New Roman" w:hAnsi="Times New Roman" w:cs="Times New Roman"/>
+        </w:rPr>
+        <w:t>Sarvet et al. (2018) have analyzed the trends in cannabis use in various states over time and stated that the common opinion and behavior in the population often does not coincide with the scientifically proven view and evidence-based guidelines. Their longitudinal study revealed that the liberalization of recreational laws raised the consumption rates regardless of the quality of the evidence that related to the medical use which indicated that the sociopolitical factors, other than the scientific evidence, was the main determinant of the formation of the behavior of the population and the trend of the use of cannabis</w:t>
       </w:r>
       <w:sdt>
         <w:sdtPr>
@@ -3010,23 +3002,7 @@
               <w:rFonts w:ascii="Times New Roman" w:hAnsi="Times New Roman" w:cs="Times New Roman"/>
               <w:color w:val="000000"/>
             </w:rPr>
-            <w:t>(</w:t>
-          </w:r>
-          <w:proofErr w:type="spellStart"/>
-          <w:r>
-            <w:rPr>
-              <w:rFonts w:ascii="Times New Roman" w:hAnsi="Times New Roman" w:cs="Times New Roman"/>
-              <w:color w:val="000000"/>
-            </w:rPr>
-            <w:t>Sarvet</w:t>
-          </w:r>
-          <w:proofErr w:type="spellEnd"/>
-          <w:r>
-            <w:rPr>
-              <w:rFonts w:ascii="Times New Roman" w:hAnsi="Times New Roman" w:cs="Times New Roman"/>
-              <w:color w:val="000000"/>
-            </w:rPr>
-            <w:t xml:space="preserve"> et al., 2018)</w:t>
+            <w:t>(Sarvet et al., 2018)</w:t>
           </w:r>
         </w:sdtContent>
       </w:sdt>
@@ -3198,23 +3174,7 @@
               <w:rFonts w:ascii="Times New Roman" w:hAnsi="Times New Roman" w:cs="Times New Roman"/>
               <w:color w:val="000000"/>
             </w:rPr>
-            <w:t>(</w:t>
-          </w:r>
-          <w:proofErr w:type="spellStart"/>
-          <w:r>
-            <w:rPr>
-              <w:rFonts w:ascii="Times New Roman" w:hAnsi="Times New Roman" w:cs="Times New Roman"/>
-              <w:color w:val="000000"/>
-            </w:rPr>
-            <w:t>Sarvet</w:t>
-          </w:r>
-          <w:proofErr w:type="spellEnd"/>
-          <w:r>
-            <w:rPr>
-              <w:rFonts w:ascii="Times New Roman" w:hAnsi="Times New Roman" w:cs="Times New Roman"/>
-              <w:color w:val="000000"/>
-            </w:rPr>
-            <w:t xml:space="preserve"> et al., 2018)</w:t>
+            <w:t>(Sarvet et al., 2018)</w:t>
           </w:r>
         </w:sdtContent>
       </w:sdt>
@@ -3779,11 +3739,165 @@
     </w:p>
     <w:p>
       <w:pPr>
+        <w:pStyle w:val="Heading2"/>
+        <w:rPr>
+          <w:rFonts w:ascii="Times New Roman" w:hAnsi="Times New Roman" w:cs="Times New Roman"/>
+          <w:sz w:val="26"/>
+          <w:szCs w:val="26"/>
+        </w:rPr>
+      </w:pPr>
+      <w:bookmarkStart w:id="44" w:name="_Toc214911783"/>
+      <w:bookmarkStart w:id="45" w:name="_Toc214915299"/>
+      <w:bookmarkStart w:id="46" w:name="_Toc214915990"/>
+      <w:r>
+        <w:rPr>
+          <w:rFonts w:ascii="Times New Roman" w:hAnsi="Times New Roman" w:cs="Times New Roman"/>
+          <w:sz w:val="26"/>
+          <w:szCs w:val="26"/>
+        </w:rPr>
+        <w:t>5.1 Points for improvement</w:t>
+      </w:r>
+      <w:bookmarkEnd w:id="44"/>
+      <w:bookmarkEnd w:id="45"/>
+      <w:bookmarkEnd w:id="46"/>
+    </w:p>
+    <w:p>
+      <w:pPr>
         <w:jc w:val="both"/>
         <w:rPr>
+          <w:rFonts w:ascii="Times New Roman" w:hAnsi="Times New Roman" w:cs="Times New Roman"/>
+        </w:rPr>
+      </w:pPr>
+      <w:r>
+        <w:rPr>
+          <w:rFonts w:ascii="Times New Roman" w:hAnsi="Times New Roman" w:cs="Times New Roman"/>
+        </w:rPr>
+        <w:t>Previous reviews of literature that are extensive in nature would have provided a better theoretical basis and hypothesis development. There were some early technical issues related to dependencies of the R packages that led to unforeseen delays in the analysis. The score of the evidence outlier 5 could have been detected earlier in the exploration analysis, which can guide the initial hypotheses. Also having investigated possible confounding factors such as intensity of media coverage, prevalence of the condition and celebrity endorsement would have given more mechanistic understanding of the weak correlation despite the big differences between the groups.</w:t>
+      </w:r>
+    </w:p>
+    <w:p>
+      <w:pPr>
+        <w:pStyle w:val="Heading2"/>
+        <w:jc w:val="both"/>
+        <w:rPr>
+          <w:rFonts w:ascii="Times New Roman" w:hAnsi="Times New Roman" w:cs="Times New Roman"/>
+          <w:sz w:val="26"/>
+          <w:szCs w:val="26"/>
+        </w:rPr>
+      </w:pPr>
+      <w:bookmarkStart w:id="47" w:name="_Toc214911784"/>
+      <w:bookmarkStart w:id="48" w:name="_Toc214915300"/>
+      <w:bookmarkStart w:id="49" w:name="_Toc214915991"/>
+      <w:r>
+        <w:rPr>
+          <w:rFonts w:ascii="Times New Roman" w:hAnsi="Times New Roman" w:cs="Times New Roman"/>
+          <w:sz w:val="26"/>
+          <w:szCs w:val="26"/>
+        </w:rPr>
+        <w:t>5.2 Group's time management</w:t>
+      </w:r>
+      <w:bookmarkEnd w:id="47"/>
+      <w:bookmarkEnd w:id="48"/>
+      <w:bookmarkEnd w:id="49"/>
+    </w:p>
+    <w:p>
+      <w:pPr>
+        <w:jc w:val="both"/>
+        <w:rPr>
+          <w:rFonts w:ascii="Times New Roman" w:hAnsi="Times New Roman" w:cs="Times New Roman"/>
+        </w:rPr>
+      </w:pPr>
+      <w:r>
+        <w:rPr>
+          <w:rFonts w:ascii="Times New Roman" w:hAnsi="Times New Roman" w:cs="Times New Roman"/>
+        </w:rPr>
+        <w:t>Time management worked well in the case of well-defined milestones of a project and regular progress monitoring structures. Nevertheless, unplanned technical problems ate up unscheduled time necessitating schedule changes. The lessons learned would be heavily useful in future projects in terms of prior verification of technical set-up, assigning the required buffer time on troubleshooting and thorough contingency planning measures.</w:t>
+      </w:r>
+    </w:p>
+    <w:p>
+      <w:pPr>
+        <w:pStyle w:val="Heading2"/>
+        <w:jc w:val="both"/>
+        <w:rPr>
+          <w:rFonts w:ascii="Times New Roman" w:hAnsi="Times New Roman" w:cs="Times New Roman"/>
+          <w:sz w:val="26"/>
+          <w:szCs w:val="26"/>
+        </w:rPr>
+      </w:pPr>
+      <w:bookmarkStart w:id="50" w:name="_Toc214911785"/>
+      <w:bookmarkStart w:id="51" w:name="_Toc214915301"/>
+      <w:bookmarkStart w:id="52" w:name="_Toc214915992"/>
+      <w:r>
+        <w:rPr>
+          <w:rFonts w:ascii="Times New Roman" w:hAnsi="Times New Roman" w:cs="Times New Roman"/>
+          <w:sz w:val="26"/>
+          <w:szCs w:val="26"/>
+        </w:rPr>
+        <w:t>5.3 Project's overall judgement</w:t>
+      </w:r>
+      <w:bookmarkEnd w:id="50"/>
+      <w:bookmarkEnd w:id="51"/>
+      <w:bookmarkEnd w:id="52"/>
+    </w:p>
+    <w:p>
+      <w:pPr>
+        <w:jc w:val="both"/>
+        <w:rPr>
+          <w:rFonts w:ascii="Times New Roman" w:hAnsi="Times New Roman" w:cs="Times New Roman"/>
+        </w:rPr>
+      </w:pPr>
+      <w:r>
+        <w:rPr>
+          <w:rFonts w:ascii="Times New Roman" w:hAnsi="Times New Roman" w:cs="Times New Roman"/>
+        </w:rPr>
+        <w:t>The project has managed to fulfill all the above-mentioned goals resulting into statistically sound results that have definite policy implications on the communication of public health. Even though there are technical difficulties, systematic analysis with methodologically suitable statistical tools was presented. Research can be useful in generating empirical data on evidence-interest gap in cannabis health communication with empirical applications.</w:t>
+      </w:r>
+    </w:p>
+    <w:p>
+      <w:pPr>
+        <w:pStyle w:val="Heading2"/>
+        <w:jc w:val="both"/>
+        <w:rPr>
+          <w:rFonts w:ascii="Times New Roman" w:hAnsi="Times New Roman" w:cs="Times New Roman"/>
+          <w:sz w:val="26"/>
+          <w:szCs w:val="26"/>
+        </w:rPr>
+      </w:pPr>
+      <w:bookmarkStart w:id="53" w:name="_Toc214911786"/>
+      <w:bookmarkStart w:id="54" w:name="_Toc214915302"/>
+      <w:bookmarkStart w:id="55" w:name="_Toc214915993"/>
+      <w:r>
+        <w:rPr>
+          <w:rFonts w:ascii="Times New Roman" w:hAnsi="Times New Roman" w:cs="Times New Roman"/>
+          <w:sz w:val="26"/>
+          <w:szCs w:val="26"/>
+        </w:rPr>
+        <w:lastRenderedPageBreak/>
+        <w:t>5.4 Discussion of the GitHub log output.</w:t>
+      </w:r>
+      <w:bookmarkEnd w:id="53"/>
+      <w:bookmarkEnd w:id="54"/>
+      <w:bookmarkEnd w:id="55"/>
+    </w:p>
+    <w:p>
+      <w:pPr>
+        <w:jc w:val="both"/>
+        <w:rPr>
           <w:rFonts w:ascii="Times New Roman" w:eastAsia="MS Mincho" w:hAnsi="Times New Roman" w:cs="Times New Roman"/>
         </w:rPr>
       </w:pPr>
+      <w:r>
+        <w:rPr>
+          <w:rFonts w:ascii="Times New Roman" w:hAnsi="Times New Roman" w:cs="Times New Roman"/>
+        </w:rPr>
+        <w:t xml:space="preserve">The GitHub repository shows systematic development in the lifecycle of project (see Appendix B). The three major commits are: Starting data exploration with quality foundations, Krunkal-Wallis test implementation with hypothesis testing evidence and the final report integration making findings into a comprehensive documentation where the reslts of the statistical tests can be reproduced and the findings communicated in a clear </w:t>
+      </w:r>
+      <w:r>
+        <w:rPr>
+          <w:rFonts w:ascii="Times New Roman" w:hAnsi="Times New Roman" w:cs="Times New Roman"/>
+        </w:rPr>
+        <w:t>ways.</w:t>
+      </w:r>
     </w:p>
     <w:p>
       <w:pPr>
@@ -5163,7 +5277,7 @@
     <w:charset w:val="00"/>
     <w:family w:val="swiss"/>
     <w:pitch w:val="variable"/>
-    <w:sig w:usb0="E4002EFF" w:usb1="C200247B" w:usb2="00000009" w:usb3="00000000" w:csb0="000001FF" w:csb1="00000000"/>
+    <w:sig w:usb0="E4002EFF" w:usb1="C000247B" w:usb2="00000009" w:usb3="00000000" w:csb0="000001FF" w:csb1="00000000"/>
   </w:font>
   <w:font w:name="Times New Roman">
     <w:panose1 w:val="02020603050405020304"/>
@@ -5177,7 +5291,7 @@
     <w:charset w:val="00"/>
     <w:family w:val="swiss"/>
     <w:pitch w:val="variable"/>
-    <w:sig w:usb0="E4002EFF" w:usb1="C200247B" w:usb2="00000009" w:usb3="00000000" w:csb0="000001FF" w:csb1="00000000"/>
+    <w:sig w:usb0="E4002EFF" w:usb1="C000247B" w:usb2="00000009" w:usb3="00000000" w:csb0="000001FF" w:csb1="00000000"/>
   </w:font>
   <w:font w:name="MS Gothic">
     <w:altName w:val="ＭＳ ゴシック"/>
@@ -5194,18 +5308,6 @@
     <w:family w:val="modern"/>
     <w:pitch w:val="fixed"/>
     <w:sig w:usb0="E00002FF" w:usb1="6AC7FDFB" w:usb2="08000012" w:usb3="00000000" w:csb0="0002009F" w:csb1="00000000"/>
-  </w:font>
-  <w:font w:name="Aptos">
-    <w:charset w:val="00"/>
-    <w:family w:val="swiss"/>
-    <w:pitch w:val="variable"/>
-    <w:sig w:usb0="20000287" w:usb1="00000003" w:usb2="00000000" w:usb3="00000000" w:csb0="0000019F" w:csb1="00000000"/>
-  </w:font>
-  <w:font w:name="Aptos Display">
-    <w:charset w:val="00"/>
-    <w:family w:val="swiss"/>
-    <w:pitch w:val="variable"/>
-    <w:sig w:usb0="20000287" w:usb1="00000003" w:usb2="00000000" w:usb3="00000000" w:csb0="0000019F" w:csb1="00000000"/>
   </w:font>
 </w:fonts>
 </file>
@@ -5231,6 +5333,7 @@
     <w:rsid w:val="002B4686"/>
     <w:rsid w:val="002B4ED2"/>
     <w:rsid w:val="004B096A"/>
+    <w:rsid w:val="0051164B"/>
     <w:rsid w:val="00515B79"/>
     <w:rsid w:val="00566A05"/>
     <w:rsid w:val="007D066A"/>
@@ -5239,6 +5342,7 @@
     <w:rsid w:val="00A85E54"/>
     <w:rsid w:val="00B722F4"/>
     <w:rsid w:val="00D428EC"/>
+    <w:rsid w:val="00DA6380"/>
     <w:rsid w:val="00E1119F"/>
     <w:rsid w:val="00E7455E"/>
     <w:rsid w:val="00EE739A"/>

</xml_diff>